<commit_message>
Dodana 8 funkcionalnost koja bolje definise ulogu treceg aktera u sistemu
</commit_message>
<xml_diff>
--- a/Specifikacija projekta.docx
+++ b/Specifikacija projekta.docx
@@ -526,7 +526,16 @@
     </w:p>
     <w:p>
       <w:r>
-        <w:t>Korisnik prilikom prvog korištenja aplikacije unosi osnovne podatke kao što su ime, prezime, datum rođenja, kontakt osoba (opcionalno) i lozinka. Sistem validira unesene podatke i kreira korisnički nalog. Nakon uspješne registracije, korisnik može pristupiti ostalim funkcionalnostima sistema. Ova funkcionalnost omogućava personalizaciju i sigurno korištenje aplikacije. Također predstavlja osnovu za dalju interakciju korisnika sa sistemom.</w:t>
+        <w:t>Korisnik prilikom prvog korištenja aplikacije unosi osnovne podatke kao što su ime, prezime, datum rođenja, kontakt osoba (opcionalno</w:t>
+      </w:r>
+      <w:r>
+        <w:t xml:space="preserve"> za</w:t>
+      </w:r>
+      <w:r>
+        <w:t xml:space="preserve"> pacijenta</w:t>
+      </w:r>
+      <w:r>
+        <w:t>) i lozinka. Sistem validira unesene podatke i kreira korisnički nalog. Nakon uspješne registracije, korisnik može pristupiti ostalim funkcionalnostima sistema. Ova funkcionalnost omogućava personalizaciju i sigurno korištenje aplikacije. Također predstavlja osnovu za dalju interakciju korisnika sa sistemom.</w:t>
       </w:r>
     </w:p>
     <w:p>
@@ -981,7 +990,7 @@
     </w:p>
     <w:p>
       <w:r>
-        <w:t>Sistem omogućava slanje obavijesti unaprijed definisanoj kontakt osobi putem SMS-a ili email-a. Ova funkcionalnost se koristi u situacijama kada korisnik ne potvrdi uzimanje terapije. Integracija sa vanjskim servisima omogućava pravovremenu reakciju bliskih osoba. Time se povećava sigurnost korisnika, posebno starijih osoba. Sistem koristi eksterni komunikacijski servis za realizaciju ove funkcije.</w:t>
+        <w:t>Sistem omogućava slanje obavijesti unaprijed definisanoj kontakt osobi putem email-a. Ova funkcionalnost se koristi u situacijama kada korisnik ne potvrdi uzimanje terapije. Integracija sa vanjskim servisima omogućava pravovremenu reakciju bliskih osoba. Time se povećava sigurnost korisnika, posebno starijih osoba. Sistem koristi eksterni komunikacijski servis za realizaciju ove funkcije.</w:t>
       </w:r>
     </w:p>
     <w:p/>
@@ -1133,6 +1142,152 @@
           <w:right w:val="nil"/>
           <w:between w:val="nil"/>
         </w:pBdr>
+      </w:pPr>
+      <w:r>
+        <w:rPr>
+          <w:b/>
+          <w:bCs/>
+          <w:color w:val="000000"/>
+        </w:rPr>
+        <w:t>Naziv funkcionalnosti</w:t>
+      </w:r>
+      <w:r>
+        <w:rPr>
+          <w:b/>
+          <w:bCs/>
+          <w:color w:val="000000"/>
+        </w:rPr>
+        <w:t>:</w:t>
+      </w:r>
+      <w:r>
+        <w:rPr>
+          <w:color w:val="808080"/>
+        </w:rPr>
+        <w:t xml:space="preserve"> </w:t>
+      </w:r>
+      <w:r>
+        <w:rPr>
+          <w:b/>
+          <w:bCs/>
+          <w:color w:val="000000"/>
+        </w:rPr>
+        <w:t>Podnošenje zahtjeva za obnovu terapije</w:t>
+      </w:r>
+    </w:p>
+    <w:p>
+      <w:pPr>
+        <w:pBdr>
+          <w:top w:val="nil"/>
+          <w:left w:val="nil"/>
+          <w:bottom w:val="nil"/>
+          <w:right w:val="nil"/>
+          <w:between w:val="nil"/>
+        </w:pBdr>
+        <w:ind w:left="360"/>
+      </w:pPr>
+    </w:p>
+    <w:p>
+      <w:pPr>
+        <w:ind w:left="720"/>
+      </w:pPr>
+      <w:r>
+        <w:rPr>
+          <w:b/>
+          <w:bCs/>
+        </w:rPr>
+        <w:t>Vrsta funkcionalnosti:</w:t>
+      </w:r>
+      <w:r>
+        <w:t xml:space="preserve"> Usluga sistema</w:t>
+      </w:r>
+    </w:p>
+    <w:p/>
+    <w:p>
+      <w:pPr>
+        <w:ind w:left="720"/>
+      </w:pPr>
+      <w:r>
+        <w:rPr>
+          <w:b/>
+          <w:bCs/>
+        </w:rPr>
+        <w:t>Opis funkcionalnosti:</w:t>
+      </w:r>
+    </w:p>
+    <w:p>
+      <w:pPr>
+        <w:ind w:left="720"/>
+      </w:pPr>
+    </w:p>
+    <w:p>
+      <w:pPr>
+        <w:ind w:left="720"/>
+        <w:rPr>
+          <w:i/>
+          <w:iCs/>
+        </w:rPr>
+      </w:pPr>
+      <w:r>
+        <w:rPr>
+          <w:i/>
+          <w:iCs/>
+        </w:rPr>
+        <w:t>Opisati način ostvarivanja funkcionalnosti sa maksimalno pet rečenica.</w:t>
+      </w:r>
+    </w:p>
+    <w:p>
+      <w:pPr>
+        <w:ind w:left="720"/>
+      </w:pPr>
+      <w:r>
+        <w:tab/>
+      </w:r>
+      <w:r>
+        <w:tab/>
+      </w:r>
+    </w:p>
+    <w:p>
+      <w:r>
+        <w:lastRenderedPageBreak/>
+        <w:t>Cilj ove funkcionalnosti je omogućiti korisnicima sistema jednostavno podnošenje zahtjeva za obnovu terapije</w:t>
+      </w:r>
+      <w:r>
+        <w:t xml:space="preserve"> i </w:t>
+      </w:r>
+      <w:r>
+        <w:t>zakazivanje termina ljekarskog pregleda</w:t>
+      </w:r>
+      <w:r>
+        <w:t xml:space="preserve">. Korisnik putem aplikacije može poslati zahtjev </w:t>
+      </w:r>
+      <w:r>
+        <w:t>odgovornom ljekaru</w:t>
+      </w:r>
+      <w:r>
+        <w:t xml:space="preserve"> bez potrebe za fizičkim dolaskom</w:t>
+      </w:r>
+      <w:r>
+        <w:t xml:space="preserve"> u zdravstvenu ustanovu</w:t>
+      </w:r>
+      <w:r>
+        <w:t>. Sistem omogućava bržu i efikasniju obradu zahtjeva u odnosu na klasične procedure. Time se smanjuju gužve u zdravstvenim ustanovama i rasterećuje medicinsko osoblje. Funkcionalnost doprinosi većoj dostupnosti zdravstvenih usluga i boljoj organizaciji procesa.</w:t>
+      </w:r>
+    </w:p>
+    <w:p/>
+    <w:p>
+      <w:pPr>
+        <w:pStyle w:val="ListParagraph"/>
+        <w:numPr>
+          <w:ilvl w:val="0"/>
+          <w:numId w:val="4"/>
+        </w:numPr>
+        <w:pBdr>
+          <w:top w:val="nil"/>
+          <w:left w:val="nil"/>
+          <w:bottom w:val="nil"/>
+          <w:right w:val="nil"/>
+          <w:between w:val="nil"/>
+        </w:pBdr>
         <w:rPr>
           <w:color w:val="000000"/>
         </w:rPr>
@@ -1152,13 +1307,10 @@
         <w:t xml:space="preserve"> </w:t>
       </w:r>
       <w:r>
-        <w:t>Mogućnost podnošenja zahtjeva za izd</w:t>
-      </w:r>
-      <w:r>
-        <w:t>a</w:t>
-      </w:r>
-      <w:r>
-        <w:t>vanje lijekova</w:t>
+        <w:t xml:space="preserve">Obrada zahtjeva </w:t>
+      </w:r>
+      <w:r>
+        <w:t>od strane ljekara</w:t>
       </w:r>
     </w:p>
     <w:p>
@@ -1218,20 +1370,38 @@
     <w:p>
       <w:pPr>
         <w:ind w:left="720"/>
-      </w:pPr>
-      <w:r>
-        <w:tab/>
-      </w:r>
-      <w:r>
-        <w:tab/>
-      </w:r>
-    </w:p>
-    <w:p>
-      <w:r>
-        <w:lastRenderedPageBreak/>
-        <w:t>Cilj ove funkcionalnosti je omogućiti korisnicima sistema jednostavno podnošenje zahtjeva za propisivanje ili obnovu terapije. Korisnik putem aplikacije može poslati zahtjev ljekaru bez potrebe za fizičkim dolaskom u zdravstvenu ustanovu. Sistem omogućava bržu i efikasniju obradu zahtjeva u odnosu na klasične procedure. Time se smanjuju gužve u zdravstvenim ustanovama i rasterećuje medicinsko osoblje. Funkcionalnost doprinosi većoj dostupnosti zdravstvenih usluga i boljoj organizaciji procesa.</w:t>
-      </w:r>
-    </w:p>
+        <w:rPr>
+          <w:i/>
+          <w:iCs/>
+        </w:rPr>
+      </w:pPr>
+    </w:p>
+    <w:p>
+      <w:pPr>
+        <w:rPr>
+          <w:lang w:val="en-US"/>
+        </w:rPr>
+      </w:pPr>
+      <w:r>
+        <w:rPr>
+          <w:lang w:val="en-US"/>
+        </w:rPr>
+        <w:t xml:space="preserve">Ljekar ima mogućnost pregleda zahtjeva za propisivanje lijeka koje je </w:t>
+      </w:r>
+      <w:r>
+        <w:rPr>
+          <w:lang w:val="en-US"/>
+        </w:rPr>
+        <w:t>podnio</w:t>
+      </w:r>
+      <w:r>
+        <w:rPr>
+          <w:lang w:val="en-US"/>
+        </w:rPr>
+        <w:t xml:space="preserve"> korisnik. Na osnovu dostupnih informacija o simptomima i terapiji, ljekar može odobriti ili odbiti zahtjev. Svaki zahtjev se jasno označava statusom kao ODOBRENO ili ODBIJENO. Ljekar je zadužen za određeni broj korisnika i njihovih terapija, čime se osigurava odgovornost i preglednost. Ova funkcionalnost omogućava dodatnu kontrolu i sigurnost u procesu preporuke i korištenja lijekova.</w:t>
+      </w:r>
+    </w:p>
+    <w:p/>
     <w:p/>
     <w:p>
       <w:r>
@@ -1768,7 +1938,15 @@
           <w:bCs/>
           <w:color w:val="000000"/>
         </w:rPr>
-        <w:t>Naziv aktera: Medicinski operater</w:t>
+        <w:t xml:space="preserve">Naziv aktera: </w:t>
+      </w:r>
+      <w:r>
+        <w:rPr>
+          <w:b/>
+          <w:bCs/>
+          <w:color w:val="000000"/>
+        </w:rPr>
+        <w:t>Medicinski operater</w:t>
       </w:r>
     </w:p>
     <w:p>
@@ -1904,13 +2082,13 @@
               <w:rPr>
                 <w:color w:val="808080"/>
               </w:rPr>
-              <w:t xml:space="preserve">2) Upravljenje </w:t>
+              <w:t xml:space="preserve">2) </w:t>
             </w:r>
             <w:r>
               <w:rPr>
                 <w:color w:val="808080"/>
               </w:rPr>
-              <w:t>terapijom</w:t>
+              <w:t>Kreiranje korisničkog računa i logovanje</w:t>
             </w:r>
           </w:p>
         </w:tc>
@@ -1928,45 +2106,6 @@
             </w:r>
             <w:r>
               <w:t>ogućnost uređivanja</w:t>
-            </w:r>
-          </w:p>
-        </w:tc>
-      </w:tr>
-      <w:tr>
-        <w:trPr>
-          <w:trHeight w:val="620"/>
-        </w:trPr>
-        <w:tc>
-          <w:tcPr>
-            <w:tcW w:w="4500" w:type="dxa"/>
-            <w:vAlign w:val="center"/>
-          </w:tcPr>
-          <w:p>
-            <w:pPr>
-              <w:jc w:val="left"/>
-              <w:rPr>
-                <w:color w:val="808080"/>
-              </w:rPr>
-            </w:pPr>
-            <w:r>
-              <w:rPr>
-                <w:color w:val="808080"/>
-              </w:rPr>
-              <w:t>4) Generisanje rasporeda terapije</w:t>
-            </w:r>
-          </w:p>
-        </w:tc>
-        <w:tc>
-          <w:tcPr>
-            <w:tcW w:w="4050" w:type="dxa"/>
-            <w:vAlign w:val="center"/>
-          </w:tcPr>
-          <w:p>
-            <w:pPr>
-              <w:jc w:val="left"/>
-            </w:pPr>
-            <w:r>
-              <w:t>Mogućnost pregleda</w:t>
             </w:r>
           </w:p>
         </w:tc>
@@ -2024,6 +2163,66 @@
           </w:p>
         </w:tc>
       </w:tr>
+      <w:tr>
+        <w:trPr>
+          <w:trHeight w:val="620"/>
+        </w:trPr>
+        <w:tc>
+          <w:tcPr>
+            <w:tcW w:w="4500" w:type="dxa"/>
+            <w:vAlign w:val="center"/>
+          </w:tcPr>
+          <w:p>
+            <w:pPr>
+              <w:jc w:val="left"/>
+              <w:rPr>
+                <w:color w:val="808080"/>
+              </w:rPr>
+            </w:pPr>
+            <w:r>
+              <w:rPr>
+                <w:color w:val="808080"/>
+              </w:rPr>
+              <w:t>8</w:t>
+            </w:r>
+            <w:r>
+              <w:rPr>
+                <w:color w:val="808080"/>
+              </w:rPr>
+              <w:t xml:space="preserve">) </w:t>
+            </w:r>
+            <w:r>
+              <w:rPr>
+                <w:color w:val="808080"/>
+              </w:rPr>
+              <w:t xml:space="preserve">Obrada zahtjeva </w:t>
+            </w:r>
+            <w:r>
+              <w:rPr>
+                <w:color w:val="808080"/>
+              </w:rPr>
+              <w:t>od strane ljekara</w:t>
+            </w:r>
+          </w:p>
+        </w:tc>
+        <w:tc>
+          <w:tcPr>
+            <w:tcW w:w="4050" w:type="dxa"/>
+            <w:vAlign w:val="center"/>
+          </w:tcPr>
+          <w:p>
+            <w:pPr>
+              <w:jc w:val="left"/>
+            </w:pPr>
+            <w:r>
+              <w:t xml:space="preserve">Mogućnost </w:t>
+            </w:r>
+            <w:r>
+              <w:t>uređivanja</w:t>
+            </w:r>
+          </w:p>
+        </w:tc>
+      </w:tr>
     </w:tbl>
     <w:p>
       <w:pPr>
@@ -2032,9 +2231,10 @@
     </w:p>
     <w:p>
       <w:pPr>
+        <w:pStyle w:val="ListParagraph"/>
         <w:numPr>
           <w:ilvl w:val="0"/>
-          <w:numId w:val="3"/>
+          <w:numId w:val="7"/>
         </w:numPr>
         <w:pBdr>
           <w:top w:val="nil"/>
@@ -2655,6 +2855,96 @@
     </w:lvl>
   </w:abstractNum>
   <w:abstractNum w:abstractNumId="1" w15:restartNumberingAfterBreak="0">
+    <w:nsid w:val="1FA12DF0"/>
+    <w:multiLevelType w:val="hybridMultilevel"/>
+    <w:tmpl w:val="6EFC155C"/>
+    <w:lvl w:ilvl="0" w:tplc="2CE48576">
+      <w:start w:val="3"/>
+      <w:numFmt w:val="lowerLetter"/>
+      <w:lvlText w:val="%1)"/>
+      <w:lvlJc w:val="left"/>
+      <w:pPr>
+        <w:ind w:left="720" w:hanging="360"/>
+      </w:pPr>
+      <w:rPr>
+        <w:rFonts w:hint="default"/>
+        <w:b/>
+      </w:rPr>
+    </w:lvl>
+    <w:lvl w:ilvl="1" w:tplc="04090019" w:tentative="1">
+      <w:start w:val="1"/>
+      <w:numFmt w:val="lowerLetter"/>
+      <w:lvlText w:val="%2."/>
+      <w:lvlJc w:val="left"/>
+      <w:pPr>
+        <w:ind w:left="1440" w:hanging="360"/>
+      </w:pPr>
+    </w:lvl>
+    <w:lvl w:ilvl="2" w:tplc="0409001B" w:tentative="1">
+      <w:start w:val="1"/>
+      <w:numFmt w:val="lowerRoman"/>
+      <w:lvlText w:val="%3."/>
+      <w:lvlJc w:val="right"/>
+      <w:pPr>
+        <w:ind w:left="2160" w:hanging="180"/>
+      </w:pPr>
+    </w:lvl>
+    <w:lvl w:ilvl="3" w:tplc="0409000F" w:tentative="1">
+      <w:start w:val="1"/>
+      <w:numFmt w:val="decimal"/>
+      <w:lvlText w:val="%4."/>
+      <w:lvlJc w:val="left"/>
+      <w:pPr>
+        <w:ind w:left="2880" w:hanging="360"/>
+      </w:pPr>
+    </w:lvl>
+    <w:lvl w:ilvl="4" w:tplc="04090019" w:tentative="1">
+      <w:start w:val="1"/>
+      <w:numFmt w:val="lowerLetter"/>
+      <w:lvlText w:val="%5."/>
+      <w:lvlJc w:val="left"/>
+      <w:pPr>
+        <w:ind w:left="3600" w:hanging="360"/>
+      </w:pPr>
+    </w:lvl>
+    <w:lvl w:ilvl="5" w:tplc="0409001B" w:tentative="1">
+      <w:start w:val="1"/>
+      <w:numFmt w:val="lowerRoman"/>
+      <w:lvlText w:val="%6."/>
+      <w:lvlJc w:val="right"/>
+      <w:pPr>
+        <w:ind w:left="4320" w:hanging="180"/>
+      </w:pPr>
+    </w:lvl>
+    <w:lvl w:ilvl="6" w:tplc="0409000F" w:tentative="1">
+      <w:start w:val="1"/>
+      <w:numFmt w:val="decimal"/>
+      <w:lvlText w:val="%7."/>
+      <w:lvlJc w:val="left"/>
+      <w:pPr>
+        <w:ind w:left="5040" w:hanging="360"/>
+      </w:pPr>
+    </w:lvl>
+    <w:lvl w:ilvl="7" w:tplc="04090019" w:tentative="1">
+      <w:start w:val="1"/>
+      <w:numFmt w:val="lowerLetter"/>
+      <w:lvlText w:val="%8."/>
+      <w:lvlJc w:val="left"/>
+      <w:pPr>
+        <w:ind w:left="5760" w:hanging="360"/>
+      </w:pPr>
+    </w:lvl>
+    <w:lvl w:ilvl="8" w:tplc="0409001B" w:tentative="1">
+      <w:start w:val="1"/>
+      <w:numFmt w:val="lowerRoman"/>
+      <w:lvlText w:val="%9."/>
+      <w:lvlJc w:val="right"/>
+      <w:pPr>
+        <w:ind w:left="6480" w:hanging="180"/>
+      </w:pPr>
+    </w:lvl>
+  </w:abstractNum>
+  <w:abstractNum w:abstractNumId="2" w15:restartNumberingAfterBreak="0">
     <w:nsid w:val="208C618C"/>
     <w:multiLevelType w:val="multilevel"/>
     <w:tmpl w:val="4240030A"/>
@@ -2740,7 +3030,93 @@
       </w:pPr>
     </w:lvl>
   </w:abstractNum>
-  <w:abstractNum w:abstractNumId="2" w15:restartNumberingAfterBreak="0">
+  <w:abstractNum w:abstractNumId="3" w15:restartNumberingAfterBreak="0">
+    <w:nsid w:val="29BE10AC"/>
+    <w:multiLevelType w:val="multilevel"/>
+    <w:tmpl w:val="02E6AF44"/>
+    <w:lvl w:ilvl="0">
+      <w:start w:val="1"/>
+      <w:numFmt w:val="decimal"/>
+      <w:lvlText w:val="%1)"/>
+      <w:lvlJc w:val="left"/>
+      <w:pPr>
+        <w:ind w:left="720" w:hanging="360"/>
+      </w:pPr>
+    </w:lvl>
+    <w:lvl w:ilvl="1">
+      <w:start w:val="1"/>
+      <w:numFmt w:val="lowerLetter"/>
+      <w:lvlText w:val="%2."/>
+      <w:lvlJc w:val="left"/>
+      <w:pPr>
+        <w:ind w:left="1440" w:hanging="360"/>
+      </w:pPr>
+    </w:lvl>
+    <w:lvl w:ilvl="2">
+      <w:start w:val="1"/>
+      <w:numFmt w:val="lowerRoman"/>
+      <w:lvlText w:val="%3."/>
+      <w:lvlJc w:val="right"/>
+      <w:pPr>
+        <w:ind w:left="2160" w:hanging="180"/>
+      </w:pPr>
+    </w:lvl>
+    <w:lvl w:ilvl="3">
+      <w:start w:val="1"/>
+      <w:numFmt w:val="decimal"/>
+      <w:lvlText w:val="%4."/>
+      <w:lvlJc w:val="left"/>
+      <w:pPr>
+        <w:ind w:left="2880" w:hanging="360"/>
+      </w:pPr>
+    </w:lvl>
+    <w:lvl w:ilvl="4">
+      <w:start w:val="1"/>
+      <w:numFmt w:val="lowerLetter"/>
+      <w:lvlText w:val="%5."/>
+      <w:lvlJc w:val="left"/>
+      <w:pPr>
+        <w:ind w:left="3600" w:hanging="360"/>
+      </w:pPr>
+    </w:lvl>
+    <w:lvl w:ilvl="5">
+      <w:start w:val="1"/>
+      <w:numFmt w:val="lowerRoman"/>
+      <w:lvlText w:val="%6."/>
+      <w:lvlJc w:val="right"/>
+      <w:pPr>
+        <w:ind w:left="4320" w:hanging="180"/>
+      </w:pPr>
+    </w:lvl>
+    <w:lvl w:ilvl="6">
+      <w:start w:val="1"/>
+      <w:numFmt w:val="decimal"/>
+      <w:lvlText w:val="%7."/>
+      <w:lvlJc w:val="left"/>
+      <w:pPr>
+        <w:ind w:left="5040" w:hanging="360"/>
+      </w:pPr>
+    </w:lvl>
+    <w:lvl w:ilvl="7">
+      <w:start w:val="1"/>
+      <w:numFmt w:val="lowerLetter"/>
+      <w:lvlText w:val="%8."/>
+      <w:lvlJc w:val="left"/>
+      <w:pPr>
+        <w:ind w:left="5760" w:hanging="360"/>
+      </w:pPr>
+    </w:lvl>
+    <w:lvl w:ilvl="8">
+      <w:start w:val="1"/>
+      <w:numFmt w:val="lowerRoman"/>
+      <w:lvlText w:val="%9."/>
+      <w:lvlJc w:val="right"/>
+      <w:pPr>
+        <w:ind w:left="6480" w:hanging="180"/>
+      </w:pPr>
+    </w:lvl>
+  </w:abstractNum>
+  <w:abstractNum w:abstractNumId="4" w15:restartNumberingAfterBreak="0">
     <w:nsid w:val="43875B1A"/>
     <w:multiLevelType w:val="multilevel"/>
     <w:tmpl w:val="635C50D2"/>
@@ -2852,7 +3228,7 @@
       </w:rPr>
     </w:lvl>
   </w:abstractNum>
-  <w:abstractNum w:abstractNumId="3" w15:restartNumberingAfterBreak="0">
+  <w:abstractNum w:abstractNumId="5" w15:restartNumberingAfterBreak="0">
     <w:nsid w:val="49F92995"/>
     <w:multiLevelType w:val="multilevel"/>
     <w:tmpl w:val="02E6AF44"/>
@@ -2938,7 +3314,7 @@
       </w:pPr>
     </w:lvl>
   </w:abstractNum>
-  <w:abstractNum w:abstractNumId="4" w15:restartNumberingAfterBreak="0">
+  <w:abstractNum w:abstractNumId="6" w15:restartNumberingAfterBreak="0">
     <w:nsid w:val="777470CB"/>
     <w:multiLevelType w:val="multilevel"/>
     <w:tmpl w:val="FD1E215C"/>
@@ -3028,19 +3404,25 @@
     </w:lvl>
   </w:abstractNum>
   <w:num w:numId="1" w16cid:durableId="1643655606">
-    <w:abstractNumId w:val="1"/>
+    <w:abstractNumId w:val="2"/>
   </w:num>
   <w:num w:numId="2" w16cid:durableId="2134010496">
-    <w:abstractNumId w:val="2"/>
+    <w:abstractNumId w:val="4"/>
   </w:num>
   <w:num w:numId="3" w16cid:durableId="1650019950">
     <w:abstractNumId w:val="0"/>
   </w:num>
   <w:num w:numId="4" w16cid:durableId="1018001765">
+    <w:abstractNumId w:val="5"/>
+  </w:num>
+  <w:num w:numId="5" w16cid:durableId="1147357244">
+    <w:abstractNumId w:val="6"/>
+  </w:num>
+  <w:num w:numId="6" w16cid:durableId="1466584847">
     <w:abstractNumId w:val="3"/>
   </w:num>
-  <w:num w:numId="5" w16cid:durableId="1147357244">
-    <w:abstractNumId w:val="4"/>
+  <w:num w:numId="7" w16cid:durableId="518198737">
+    <w:abstractNumId w:val="1"/>
   </w:num>
 </w:numbering>
 </file>
@@ -3569,7 +3951,6 @@
   <w:style w:type="character" w:default="1" w:styleId="DefaultParagraphFont">
     <w:name w:val="Default Paragraph Font"/>
     <w:uiPriority w:val="1"/>
-    <w:semiHidden/>
     <w:unhideWhenUsed/>
   </w:style>
   <w:style w:type="table" w:default="1" w:styleId="TableNormal">
@@ -3680,6 +4061,17 @@
         <w:right w:w="108" w:type="dxa"/>
       </w:tblCellMar>
     </w:tblPr>
+  </w:style>
+  <w:style w:type="paragraph" w:styleId="ListParagraph">
+    <w:name w:val="List Paragraph"/>
+    <w:basedOn w:val="Normal"/>
+    <w:uiPriority w:val="34"/>
+    <w:qFormat/>
+    <w:rsid w:val="006B6505"/>
+    <w:pPr>
+      <w:ind w:left="720"/>
+      <w:contextualSpacing/>
+    </w:pPr>
   </w:style>
 </w:styles>
 </file>

</xml_diff>